<commit_message>
chore(resume): sync latest resume variants
Auto-synced by GitResume Agent.
</commit_message>
<xml_diff>
--- a/public/resume/Naman_Manocha_AI_Engineer_Resume.docx
+++ b/public/resume/Naman_Manocha_AI_Engineer_Resume.docx
@@ -109,63 +109,7 @@
         <w:spacing w:after="100"/>
       </w:pPr>
       <w:r>
-        <w:rPr>
-          <w:rFonts w:ascii="Calibri" w:cs="Calibri" w:eastAsia="Calibri" w:hAnsi="Calibri"/>
-          <w:i w:val="false"/>
-          <w:iCs w:val="false"/>
-          <w:color w:val="1A1A1A"/>
-          <w:sz w:val="19"/>
-          <w:szCs w:val="19"/>
-        </w:rPr>
-        <w:t xml:space="preserve">AI/ML engineer who ships production systems end-to-end — data pipelines, model/retrieval logic, backend APIs, and deployment. Solo-built </w:t>
-      </w:r>
-      <w:r>
-        <w:rPr>
-          <w:rFonts w:ascii="Calibri" w:cs="Calibri" w:eastAsia="Calibri" w:hAnsi="Calibri"/>
-          <w:b/>
-          <w:bCs/>
-          <w:i w:val="false"/>
-          <w:iCs w:val="false"/>
-          <w:color w:val="1A1A1A"/>
-          <w:sz w:val="19"/>
-          <w:szCs w:val="19"/>
-        </w:rPr>
-        <w:t xml:space="preserve">FundersAI</w:t>
-      </w:r>
-      <w:r>
-        <w:rPr>
-          <w:rFonts w:ascii="Calibri" w:cs="Calibri" w:eastAsia="Calibri" w:hAnsi="Calibri"/>
-          <w:i w:val="false"/>
-          <w:iCs w:val="false"/>
-          <w:color w:val="1A1A1A"/>
-          <w:sz w:val="19"/>
-          <w:szCs w:val="19"/>
-        </w:rPr>
-        <w:t xml:space="preserve">, a research platform combining deterministic financial metrics, hybrid retrieval, and explainable ML clustering, and </w:t>
-      </w:r>
-      <w:r>
-        <w:rPr>
-          <w:rFonts w:ascii="Calibri" w:cs="Calibri" w:eastAsia="Calibri" w:hAnsi="Calibri"/>
-          <w:b/>
-          <w:bCs/>
-          <w:i w:val="false"/>
-          <w:iCs w:val="false"/>
-          <w:color w:val="1A1A1A"/>
-          <w:sz w:val="19"/>
-          <w:szCs w:val="19"/>
-        </w:rPr>
-        <w:t xml:space="preserve">CareFlow Intelligence</w:t>
-      </w:r>
-      <w:r>
-        <w:rPr>
-          <w:rFonts w:ascii="Calibri" w:cs="Calibri" w:eastAsia="Calibri" w:hAnsi="Calibri"/>
-          <w:i w:val="false"/>
-          <w:iCs w:val="false"/>
-          <w:color w:val="1A1A1A"/>
-          <w:sz w:val="19"/>
-          <w:szCs w:val="19"/>
-        </w:rPr>
-        <w:t xml:space="preserve">, an agentic RAG + fine-tuning system. Currently building and shipping AI products independently to gain hands-on production experience. Stack: Python/FastAPI, Next.js/React, Supabase/PostgreSQL, Docker/Kubernetes.</w:t>
+        <w:t>AI/ML engineer who ships end-to-end research products spanning data pipelines, retrieval and model logic, backend APIs, and deployment. Independently developed FundersAI, a research platform combining deterministic financial metrics, hybrid retrieval, and explainable ML clustering, and CareFlow Intelligence, an agentic RAG and fine-tuning system. Currently developing AI products independently. Core technologies: Python, FastAPI, Next.js, Supabase/PostgreSQL, Docker, and Kubernetes.</w:t>
       </w:r>
     </w:p>
     <w:p>
@@ -193,28 +137,7 @@
         <w:spacing w:after="40"/>
       </w:pPr>
       <w:r>
-        <w:rPr>
-          <w:rFonts w:ascii="Calibri" w:cs="Calibri" w:eastAsia="Calibri" w:hAnsi="Calibri"/>
-          <w:b/>
-          <w:bCs/>
-          <w:i w:val="false"/>
-          <w:iCs w:val="false"/>
-          <w:color w:val="1A1A1A"/>
-          <w:sz w:val="19"/>
-          <w:szCs w:val="19"/>
-        </w:rPr>
-        <w:t xml:space="preserve">ML &amp; AI:</w:t>
-      </w:r>
-      <w:r>
-        <w:rPr>
-          <w:rFonts w:ascii="Calibri" w:cs="Calibri" w:eastAsia="Calibri" w:hAnsi="Calibri"/>
-          <w:i w:val="false"/>
-          <w:iCs w:val="false"/>
-          <w:color w:val="1A1A1A"/>
-          <w:sz w:val="19"/>
-          <w:szCs w:val="19"/>
-        </w:rPr>
-        <w:t xml:space="preserve"> RAG (LangGraph), Hybrid Search, Vector Embeddings (pgvector, ChromaDB), K-Means Clustering, Logistic Regression, MLflow, scikit-learn, Prompt Engineering, Hugging Face, AI Observability (Langfuse)</w:t>
+        <w:t>ML &amp; AI: LangGraph, RAG, Hybrid Search, pgvector, ChromaDB, K-Means Clustering, Logistic Regression, MLflow, scikit-learn, Prompt Engineering, Hugging Face, Langfuse</w:t>
       </w:r>
     </w:p>
     <w:p>
@@ -222,28 +145,7 @@
         <w:spacing w:after="40"/>
       </w:pPr>
       <w:r>
-        <w:rPr>
-          <w:rFonts w:ascii="Calibri" w:cs="Calibri" w:eastAsia="Calibri" w:hAnsi="Calibri"/>
-          <w:b/>
-          <w:bCs/>
-          <w:i w:val="false"/>
-          <w:iCs w:val="false"/>
-          <w:color w:val="1A1A1A"/>
-          <w:sz w:val="19"/>
-          <w:szCs w:val="19"/>
-        </w:rPr>
-        <w:t xml:space="preserve">Backend &amp; Infra:</w:t>
-      </w:r>
-      <w:r>
-        <w:rPr>
-          <w:rFonts w:ascii="Calibri" w:cs="Calibri" w:eastAsia="Calibri" w:hAnsi="Calibri"/>
-          <w:i w:val="false"/>
-          <w:iCs w:val="false"/>
-          <w:color w:val="1A1A1A"/>
-          <w:sz w:val="19"/>
-          <w:szCs w:val="19"/>
-        </w:rPr>
-        <w:t xml:space="preserve"> Python, FastAPI, REST APIs, SQL, PostgreSQL, Supabase, Redis, Docker, Kubernetes (K3s), GitHub Actions (CI/CD), Google Cloud Run, Vercel</w:t>
+        <w:t>Backend &amp; Cloud: Python, FastAPI, REST APIs, SQL, PostgreSQL, Supabase, Redis, Docker, Kubernetes, GitHub Actions, Google Cloud Run</w:t>
       </w:r>
     </w:p>
     <w:p>
@@ -251,28 +153,7 @@
         <w:spacing w:after="40"/>
       </w:pPr>
       <w:r>
-        <w:rPr>
-          <w:rFonts w:ascii="Calibri" w:cs="Calibri" w:eastAsia="Calibri" w:hAnsi="Calibri"/>
-          <w:b/>
-          <w:bCs/>
-          <w:i w:val="false"/>
-          <w:iCs w:val="false"/>
-          <w:color w:val="1A1A1A"/>
-          <w:sz w:val="19"/>
-          <w:szCs w:val="19"/>
-        </w:rPr>
-        <w:t xml:space="preserve">Frontend &amp; Data:</w:t>
-      </w:r>
-      <w:r>
-        <w:rPr>
-          <w:rFonts w:ascii="Calibri" w:cs="Calibri" w:eastAsia="Calibri" w:hAnsi="Calibri"/>
-          <w:i w:val="false"/>
-          <w:iCs w:val="false"/>
-          <w:color w:val="1A1A1A"/>
-          <w:sz w:val="19"/>
-          <w:szCs w:val="19"/>
-        </w:rPr>
-        <w:t xml:space="preserve"> Next.js, React, TypeScript, ETL Pipelines, Web Scraping, Data Validation &amp; Visualization</w:t>
+        <w:t>Web &amp; Data: Next.js, React, TypeScript, ETL Pipelines, Web Scraping, Data Validation</w:t>
       </w:r>
     </w:p>
     <w:p>
@@ -354,15 +235,7 @@
         <w:spacing w:after="45"/>
       </w:pPr>
       <w:r>
-        <w:rPr>
-          <w:rFonts w:ascii="Calibri" w:cs="Calibri" w:eastAsia="Calibri" w:hAnsi="Calibri"/>
-          <w:i w:val="false"/>
-          <w:iCs w:val="false"/>
-          <w:color w:val="1A1A1A"/>
-          <w:sz w:val="19"/>
-          <w:szCs w:val="19"/>
-        </w:rPr>
-        <w:t xml:space="preserve">Scoping and leading development of a company-wide mobile app as sole engineer — client/employee onboarding, document access, product registration, and payments.</w:t>
+        <w:t>Scoping and leading development of a company-wide mobile app as sole engineer — client/employee onboarding, document access, product activation, and payments.</w:t>
       </w:r>
     </w:p>
     <w:p>
@@ -447,7 +320,7 @@
         <w:rPr>
           <w:i/>
         </w:rPr>
-        <w:t>Python, FastAPI, Next.js, Supabase/pgvector, LangGraph, Groq, OpenAI, Cloudflare R2  |  ~142K LOC, 864 files, 434 commits, 167+ test suites — OpenAI Build Week</w:t>
+        <w:t>Python, FastAPI, Next.js, Supabase/pgvector, LangGraph, Groq, OpenAI, Cloudflare R2  |  ~137K source LOC, 826 files, 434 commits, 167 test files — OpenAI Build Week</w:t>
       </w:r>
       <w:r>
         <w:rPr>
@@ -504,28 +377,7 @@
         <w:spacing w:after="45"/>
       </w:pPr>
       <w:r>
-        <w:rPr>
-          <w:rFonts w:ascii="Calibri" w:cs="Calibri" w:eastAsia="Calibri" w:hAnsi="Calibri"/>
-          <w:b/>
-          <w:bCs/>
-          <w:i w:val="false"/>
-          <w:iCs w:val="false"/>
-          <w:color w:val="1A1A1A"/>
-          <w:sz w:val="19"/>
-          <w:szCs w:val="19"/>
-        </w:rPr>
-        <w:t xml:space="preserve">Citation-Grounded RAG:</w:t>
-      </w:r>
-      <w:r>
-        <w:rPr>
-          <w:rFonts w:ascii="Calibri" w:cs="Calibri" w:eastAsia="Calibri" w:hAnsi="Calibri"/>
-          <w:i w:val="false"/>
-          <w:iCs w:val="false"/>
-          <w:color w:val="1A1A1A"/>
-          <w:sz w:val="19"/>
-          <w:szCs w:val="19"/>
-        </w:rPr>
-        <w:t xml:space="preserve"> 7-node LangGraph pipeline (retrieve → grade → synthesize/abstain, with query-rewrite loop) over ~10,400 embedded chunks with lexical reranking and strict LLM abstention — eliminates hallucinated financial claims.</w:t>
+        <w:t>Citation-Grounded RAG: built a seven-stage LangGraph workflow with retrieval grading, query rewriting, citation-aware synthesis, and explicit abstention when evidence is insufficient.</w:t>
       </w:r>
     </w:p>
     <w:p>
@@ -572,28 +424,7 @@
         <w:spacing w:after="45"/>
       </w:pPr>
       <w:r>
-        <w:rPr>
-          <w:rFonts w:ascii="Calibri" w:cs="Calibri" w:eastAsia="Calibri" w:hAnsi="Calibri"/>
-          <w:b/>
-          <w:bCs/>
-          <w:i w:val="false"/>
-          <w:iCs w:val="false"/>
-          <w:color w:val="1A1A1A"/>
-          <w:sz w:val="19"/>
-          <w:szCs w:val="19"/>
-        </w:rPr>
-        <w:t xml:space="preserve">Data Engineering:</w:t>
-      </w:r>
-      <w:r>
-        <w:rPr>
-          <w:rFonts w:ascii="Calibri" w:cs="Calibri" w:eastAsia="Calibri" w:hAnsi="Calibri"/>
-          <w:i w:val="false"/>
-          <w:iCs w:val="false"/>
-          <w:color w:val="1A1A1A"/>
-          <w:sz w:val="19"/>
-          <w:szCs w:val="19"/>
-        </w:rPr>
-        <w:t xml:space="preserve"> 22-workflow GitHub Actions pipeline scraping/normalizing disclosures from 12 AMCs, reaching 99.66% data-readiness across 871 fund schemes; fixed a normalizer bug affecting 14,000+ records, raising coverage from 83% to 100%.</w:t>
+        <w:t>Data Engineering: automated collection and normalization of official mutual-fund disclosures, with data-quality checks and targeted normalizer fixes for affected records.</w:t>
       </w:r>
     </w:p>
     <w:p>
@@ -655,28 +486,7 @@
         <w:spacing w:after="45"/>
       </w:pPr>
       <w:r>
-        <w:rPr>
-          <w:rFonts w:ascii="Calibri" w:cs="Calibri" w:eastAsia="Calibri" w:hAnsi="Calibri"/>
-          <w:b/>
-          <w:bCs/>
-          <w:i w:val="false"/>
-          <w:iCs w:val="false"/>
-          <w:color w:val="1A1A1A"/>
-          <w:sz w:val="19"/>
-          <w:szCs w:val="19"/>
-        </w:rPr>
-        <w:t xml:space="preserve">Agentic RAG + Ingestion:</w:t>
-      </w:r>
-      <w:r>
-        <w:rPr>
-          <w:rFonts w:ascii="Calibri" w:cs="Calibri" w:eastAsia="Calibri" w:hAnsi="Calibri"/>
-          <w:i w:val="false"/>
-          <w:iCs w:val="false"/>
-          <w:color w:val="1A1A1A"/>
-          <w:sz w:val="19"/>
-          <w:szCs w:val="19"/>
-        </w:rPr>
-        <w:t xml:space="preserve"> built a bounded-tool-loop citation-grounded document agent over 4 automated ingestion pipelines (OpenFDA, PubMed, clinical guidelines, media) indexing 37 documents into 620 chunks.</w:t>
+        <w:t>Agentic RAG + Ingestion: built a citation-grounded document agent with automated ingestion from OpenFDA, PubMed, clinical-guideline, and media sources.</w:t>
       </w:r>
     </w:p>
     <w:p>
@@ -689,28 +499,7 @@
         <w:spacing w:after="45"/>
       </w:pPr>
       <w:r>
-        <w:rPr>
-          <w:rFonts w:ascii="Calibri" w:cs="Calibri" w:eastAsia="Calibri" w:hAnsi="Calibri"/>
-          <w:b/>
-          <w:bCs/>
-          <w:i w:val="false"/>
-          <w:iCs w:val="false"/>
-          <w:color w:val="1A1A1A"/>
-          <w:sz w:val="19"/>
-          <w:szCs w:val="19"/>
-        </w:rPr>
-        <w:t xml:space="preserve">RAFT Fine-Tuning:</w:t>
-      </w:r>
-      <w:r>
-        <w:rPr>
-          <w:rFonts w:ascii="Calibri" w:cs="Calibri" w:eastAsia="Calibri" w:hAnsi="Calibri"/>
-          <w:i w:val="false"/>
-          <w:iCs w:val="false"/>
-          <w:color w:val="1A1A1A"/>
-          <w:sz w:val="19"/>
-          <w:szCs w:val="19"/>
-        </w:rPr>
-        <w:t xml:space="preserve"> ran a RAFT pipeline (oracle evidence, hard distractors, abstention cases) to fine-tune Qwen2.5-7B via 4-bit QLoRA (Unsloth) — 88.5% citation precision, 92.3% recall — then quantized to GGUF and served locally via Ollama. A second Data Intake Agent enforces human-approval gates on autonomous data ingestion.</w:t>
+        <w:t>RAFT Fine-Tuning: built a training-data pipeline with reference evidence, hard distractors, and abstention cases; fine-tuned Qwen2.5-1.5B via 4-bit QLoRA (rank 16, alpha 16), quantized it to GGUF, and served it locally via Ollama with human approval gates for data intake.</w:t>
       </w:r>
     </w:p>
     <w:p>
@@ -756,7 +545,7 @@
         <w:spacing w:after="45"/>
       </w:pPr>
       <w:r>
-        <w:t>TalentOS (All Things Agentic Hackathon, Taskmaster Track): dual-pipeline autonomous agent platform (Google ADK, LangGraph, Firestore) ingesting ~2,500 postings/run across 8 sources with 91% pre-filtering and a 3-state evaluator+drafter chain — ~23K LOC, 131 files, 235+ tests | Live: https://all-things-agentic--allthingsagentic-505213.asia-southeast1.hosted.app | Repo: https://github.com/Naman6019/all-things-agentic. FundersAI Reports: decoupled LangGraph microservice on a 2-replica Kubernetes Deployment (K3s/AWS EC2). SQuAD QA Benchmarking: fine-tuned/benchmarked BERT/BiDAF/DistilBERT; published as a research paper. GitResume: self-built multi-agent LLM pipeline (PyPI: git-resume-agent, ~4K LOC, 26 commits) that synthesizes and adversarially verifies grounded resume bullets from git history.</w:t>
+        <w:t>TalentOS (All Things Agentic Hackathon, Taskmaster Track): dual-pipeline opportunity platform using Google ADK, LangGraph, and Firestore to collect public opportunities, apply deterministic pre-filtering, and generate human-reviewable application materials. FundersAI Reports: decoupled LangGraph report-synthesis service hosted on K3s. SQuAD QA Benchmarking: fine-tuned and benchmarked BERT, BiDAF, and DistilBERT; published as a research paper. GitResume: self-built evidence-backed resume CLI (PyPI: git-resume-agent, ~4K LOC, 27 commits) that validates managed claims before compiling Word/PDF output.</w:t>
       </w:r>
     </w:p>
     <w:p>

</xml_diff>